<commit_message>
Add automatic table styling with dark grey borders, shaded headers, and cell spacing
</commit_message>
<xml_diff>
--- a/lesson_output.docx
+++ b/lesson_output.docx
@@ -5,6 +5,7 @@
     <w:p>
       <w:pPr>
         <w:pStyle w:val="Title"/>
+        <w:spacing w:before="320" w:after="120"/>
       </w:pPr>
       <w:r>
         <w:t xml:space="preserve">LESSON TAKEAWAYS: GRADE 7 LESSON 1-9 DIVIDE RATIONAL NUMBERS</w:t>
@@ -14,6 +15,7 @@
     <w:p>
       <w:pPr>
         <w:pStyle w:val="Heading1"/>
+        <w:spacing w:before="320" w:after="120"/>
       </w:pPr>
       <w:r>
         <w:t xml:space="preserve">PART 1: ADDING TO YOUR MATH TOOLBOX</w:t>
@@ -23,6 +25,7 @@
     <w:p>
       <w:pPr>
         <w:pStyle w:val="Heading2"/>
+        <w:spacing w:before="240" w:after="80"/>
       </w:pPr>
       <w:r>
         <w:t xml:space="preserve">Tool 1: Dividing Rational Numbers with Different Signs</w:t>
@@ -34,6 +37,20 @@
         <w:tblW w:type="pct" w:w="5000"/>
         <w:tblLayout w:type="fixed"/>
         <w:tblLook w:firstRow="1" w:lastRow="0" w:firstColumn="0" w:lastColumn="0" w:noHBand="0" w:noVBand="0" w:val="0020"/>
+        <w:tblBorders>
+          <w:top w:val="single" w:sz="8" w:space="0" w:color="555555"/>
+          <w:left w:val="single" w:sz="8" w:space="0" w:color="555555"/>
+          <w:bottom w:val="single" w:sz="8" w:space="0" w:color="555555"/>
+          <w:right w:val="single" w:sz="8" w:space="0" w:color="555555"/>
+          <w:insideH w:val="single" w:sz="6" w:space="0" w:color="555555"/>
+          <w:insideV w:val="single" w:sz="6" w:space="0" w:color="555555"/>
+        </w:tblBorders>
+        <w:tblCellMar>
+          <w:top w:w="160" w:type="dxa"/>
+          <w:bottom w:w="160" w:type="dxa"/>
+          <w:left w:w="200" w:type="dxa"/>
+          <w:right w:w="200" w:type="dxa"/>
+        </w:tblCellMar>
       </w:tblPr>
       <w:tblGrid>
         <w:gridCol w:w="3960"/>
@@ -42,38 +59,60 @@
       <w:tr>
         <w:trPr>
           <w:tblHeader w:val="on"/>
+          <w:cantSplit/>
+          <w:tblHeader/>
         </w:trPr>
         <w:tc>
-          <w:tcPr/>
+          <w:tcPr>
+            <w:vAlign w:val="center"/>
+            <w:shd w:fill="E2E8F0"/>
+          </w:tcPr>
           <w:p>
             <w:pPr>
               <w:pStyle w:val="Compact"/>
+              <w:spacing w:before="80" w:after="80"/>
               <w:jc w:val="left"/>
             </w:pPr>
             <w:r>
+              <w:rPr>
+                <w:b/>
+              </w:rPr>
               <w:t xml:space="preserve">Problem</w:t>
             </w:r>
           </w:p>
         </w:tc>
         <w:tc>
-          <w:tcPr/>
+          <w:tcPr>
+            <w:vAlign w:val="center"/>
+            <w:shd w:fill="E2E8F0"/>
+          </w:tcPr>
           <w:p>
             <w:pPr>
               <w:pStyle w:val="Compact"/>
+              <w:spacing w:before="80" w:after="80"/>
               <w:jc w:val="left"/>
             </w:pPr>
             <w:r>
+              <w:rPr>
+                <w:b/>
+              </w:rPr>
               <w:t xml:space="preserve">Steps</w:t>
             </w:r>
           </w:p>
         </w:tc>
       </w:tr>
       <w:tr>
+        <w:trPr>
+          <w:cantSplit/>
+        </w:trPr>
         <w:tc>
-          <w:tcPr/>
+          <w:tcPr>
+            <w:vAlign w:val="center"/>
+          </w:tcPr>
           <w:p>
             <w:pPr>
               <w:pStyle w:val="Compact"/>
+              <w:spacing w:before="60" w:after="60"/>
               <w:jc w:val="left"/>
             </w:pPr>
             <w:r>
@@ -126,10 +165,13 @@
           </w:p>
         </w:tc>
         <w:tc>
-          <w:tcPr/>
+          <w:tcPr>
+            <w:vAlign w:val="center"/>
+          </w:tcPr>
           <w:p>
             <w:pPr>
               <w:pStyle w:val="Compact"/>
+              <w:spacing w:before="60" w:after="60"/>
             </w:pPr>
           </w:p>
         </w:tc>
@@ -140,6 +182,7 @@
     <w:p>
       <w:pPr>
         <w:pStyle w:val="Heading2"/>
+        <w:spacing w:before="240" w:after="80"/>
       </w:pPr>
       <w:r>
         <w:t xml:space="preserve">Tool 2: Dividing Complex Fractions with Different Signs</w:t>
@@ -151,6 +194,20 @@
         <w:tblW w:type="pct" w:w="5000"/>
         <w:tblLayout w:type="fixed"/>
         <w:tblLook w:firstRow="1" w:lastRow="0" w:firstColumn="0" w:lastColumn="0" w:noHBand="0" w:noVBand="0" w:val="0020"/>
+        <w:tblBorders>
+          <w:top w:val="single" w:sz="8" w:space="0" w:color="555555"/>
+          <w:left w:val="single" w:sz="8" w:space="0" w:color="555555"/>
+          <w:bottom w:val="single" w:sz="8" w:space="0" w:color="555555"/>
+          <w:right w:val="single" w:sz="8" w:space="0" w:color="555555"/>
+          <w:insideH w:val="single" w:sz="6" w:space="0" w:color="555555"/>
+          <w:insideV w:val="single" w:sz="6" w:space="0" w:color="555555"/>
+        </w:tblBorders>
+        <w:tblCellMar>
+          <w:top w:w="160" w:type="dxa"/>
+          <w:bottom w:w="160" w:type="dxa"/>
+          <w:left w:w="200" w:type="dxa"/>
+          <w:right w:w="200" w:type="dxa"/>
+        </w:tblCellMar>
       </w:tblPr>
       <w:tblGrid>
         <w:gridCol w:w="3960"/>
@@ -159,38 +216,60 @@
       <w:tr>
         <w:trPr>
           <w:tblHeader w:val="on"/>
+          <w:cantSplit/>
+          <w:tblHeader/>
         </w:trPr>
         <w:tc>
-          <w:tcPr/>
+          <w:tcPr>
+            <w:vAlign w:val="center"/>
+            <w:shd w:fill="E2E8F0"/>
+          </w:tcPr>
           <w:p>
             <w:pPr>
               <w:pStyle w:val="Compact"/>
+              <w:spacing w:before="80" w:after="80"/>
               <w:jc w:val="left"/>
             </w:pPr>
             <w:r>
+              <w:rPr>
+                <w:b/>
+              </w:rPr>
               <w:t xml:space="preserve">Problem</w:t>
             </w:r>
           </w:p>
         </w:tc>
         <w:tc>
-          <w:tcPr/>
+          <w:tcPr>
+            <w:vAlign w:val="center"/>
+            <w:shd w:fill="E2E8F0"/>
+          </w:tcPr>
           <w:p>
             <w:pPr>
               <w:pStyle w:val="Compact"/>
+              <w:spacing w:before="80" w:after="80"/>
               <w:jc w:val="left"/>
             </w:pPr>
             <w:r>
+              <w:rPr>
+                <w:b/>
+              </w:rPr>
               <w:t xml:space="preserve">Steps</w:t>
             </w:r>
           </w:p>
         </w:tc>
       </w:tr>
       <w:tr>
+        <w:trPr>
+          <w:cantSplit/>
+        </w:trPr>
         <w:tc>
-          <w:tcPr/>
+          <w:tcPr>
+            <w:vAlign w:val="center"/>
+          </w:tcPr>
           <w:p>
             <w:pPr>
               <w:pStyle w:val="Compact"/>
+              <w:spacing w:before="60" w:after="60"/>
               <w:jc w:val="left"/>
             </w:pPr>
             <w:r>
@@ -258,10 +337,13 @@
           </w:p>
         </w:tc>
         <w:tc>
-          <w:tcPr/>
+          <w:tcPr>
+            <w:vAlign w:val="center"/>
+          </w:tcPr>
           <w:p>
             <w:pPr>
               <w:pStyle w:val="Compact"/>
+              <w:spacing w:before="60" w:after="60"/>
             </w:pPr>
           </w:p>
         </w:tc>
@@ -273,6 +355,7 @@
     <w:p>
       <w:pPr>
         <w:pStyle w:val="Heading1"/>
+        <w:spacing w:before="320" w:after="120"/>
       </w:pPr>
       <w:r>
         <w:t xml:space="preserve">PART 2: CHECK YOUR UNDERSTANDING</w:t>

</xml_diff>

<commit_message>
Implement dynamic 2-page layout, tool table widths, and CYU spacing
</commit_message>
<xml_diff>
--- a/lesson_output.docx
+++ b/lesson_output.docx
@@ -15,7 +15,7 @@
     <w:p>
       <w:pPr>
         <w:pStyle w:val="Heading1"/>
-        <w:spacing w:before="320" w:after="120"/>
+        <w:spacing w:before="160" w:after="80"/>
       </w:pPr>
       <w:r>
         <w:t xml:space="preserve">PART 1: ADDING TO YOUR MATH TOOLBOX</w:t>
@@ -25,7 +25,7 @@
     <w:p>
       <w:pPr>
         <w:pStyle w:val="Heading2"/>
-        <w:spacing w:before="240" w:after="80"/>
+        <w:spacing w:before="120" w:after="40"/>
       </w:pPr>
       <w:r>
         <w:t xml:space="preserve">Tool 1: Dividing Rational Numbers with Different Signs</w:t>
@@ -34,7 +34,6 @@
     <w:tbl>
       <w:tblPr>
         <w:tblStyle w:val="Table"/>
-        <w:tblW w:type="pct" w:w="5000"/>
         <w:tblLayout w:type="fixed"/>
         <w:tblLook w:firstRow="1" w:lastRow="0" w:firstColumn="0" w:lastColumn="0" w:noHBand="0" w:noVBand="0" w:val="0020"/>
         <w:tblBorders>
@@ -46,11 +45,13 @@
           <w:insideV w:val="single" w:sz="6" w:space="0" w:color="555555"/>
         </w:tblBorders>
         <w:tblCellMar>
-          <w:top w:w="160" w:type="dxa"/>
-          <w:bottom w:w="160" w:type="dxa"/>
-          <w:left w:w="200" w:type="dxa"/>
-          <w:right w:w="200" w:type="dxa"/>
+          <w:top w:w="140" w:type="dxa"/>
+          <w:bottom w:w="140" w:type="dxa"/>
+          <w:left w:w="180" w:type="dxa"/>
+          <w:right w:w="180" w:type="dxa"/>
         </w:tblCellMar>
+        <w:jc w:val="left"/>
+        <w:tblW w:w="7200" w:type="dxa"/>
       </w:tblPr>
       <w:tblGrid>
         <w:gridCol w:w="3960"/>
@@ -61,11 +62,15 @@
           <w:tblHeader w:val="on"/>
           <w:cantSplit/>
           <w:tblHeader/>
+          <w:cantSplit/>
+          <w:tblHeader/>
         </w:trPr>
         <w:tc>
           <w:tcPr>
             <w:vAlign w:val="center"/>
-            <w:shd w:fill="E2E8F0"/>
+            <w:tcW w:w="4608" w:type="dxa"/>
+            <w:vAlign w:val="center"/>
+            <w:shd w:fill="E8EDF2"/>
           </w:tcPr>
           <w:p>
             <w:pPr>
@@ -84,7 +89,9 @@
         <w:tc>
           <w:tcPr>
             <w:vAlign w:val="center"/>
-            <w:shd w:fill="E2E8F0"/>
+            <w:tcW w:w="2592" w:type="dxa"/>
+            <w:vAlign w:val="center"/>
+            <w:shd w:fill="E8EDF2"/>
           </w:tcPr>
           <w:p>
             <w:pPr>
@@ -104,9 +111,13 @@
       <w:tr>
         <w:trPr>
           <w:cantSplit/>
+          <w:cantSplit/>
+          <w:trHeight w:hRule="atLeast" w:val="1368"/>
         </w:trPr>
         <w:tc>
           <w:tcPr>
+            <w:vAlign w:val="center"/>
+            <w:tcW w:w="4608" w:type="dxa"/>
             <w:vAlign w:val="center"/>
           </w:tcPr>
           <w:p>
@@ -167,6 +178,8 @@
         <w:tc>
           <w:tcPr>
             <w:vAlign w:val="center"/>
+            <w:tcW w:w="2592" w:type="dxa"/>
+            <w:vAlign w:val="center"/>
           </w:tcPr>
           <w:p>
             <w:pPr>
@@ -182,7 +195,7 @@
     <w:p>
       <w:pPr>
         <w:pStyle w:val="Heading2"/>
-        <w:spacing w:before="240" w:after="80"/>
+        <w:spacing w:before="120" w:after="40"/>
       </w:pPr>
       <w:r>
         <w:t xml:space="preserve">Tool 2: Dividing Complex Fractions with Different Signs</w:t>
@@ -191,7 +204,6 @@
     <w:tbl>
       <w:tblPr>
         <w:tblStyle w:val="Table"/>
-        <w:tblW w:type="pct" w:w="5000"/>
         <w:tblLayout w:type="fixed"/>
         <w:tblLook w:firstRow="1" w:lastRow="0" w:firstColumn="0" w:lastColumn="0" w:noHBand="0" w:noVBand="0" w:val="0020"/>
         <w:tblBorders>
@@ -203,11 +215,13 @@
           <w:insideV w:val="single" w:sz="6" w:space="0" w:color="555555"/>
         </w:tblBorders>
         <w:tblCellMar>
-          <w:top w:w="160" w:type="dxa"/>
-          <w:bottom w:w="160" w:type="dxa"/>
-          <w:left w:w="200" w:type="dxa"/>
-          <w:right w:w="200" w:type="dxa"/>
+          <w:top w:w="140" w:type="dxa"/>
+          <w:bottom w:w="140" w:type="dxa"/>
+          <w:left w:w="180" w:type="dxa"/>
+          <w:right w:w="180" w:type="dxa"/>
         </w:tblCellMar>
+        <w:jc w:val="left"/>
+        <w:tblW w:w="7200" w:type="dxa"/>
       </w:tblPr>
       <w:tblGrid>
         <w:gridCol w:w="3960"/>
@@ -218,11 +232,15 @@
           <w:tblHeader w:val="on"/>
           <w:cantSplit/>
           <w:tblHeader/>
+          <w:cantSplit/>
+          <w:tblHeader/>
         </w:trPr>
         <w:tc>
           <w:tcPr>
             <w:vAlign w:val="center"/>
-            <w:shd w:fill="E2E8F0"/>
+            <w:tcW w:w="4608" w:type="dxa"/>
+            <w:vAlign w:val="center"/>
+            <w:shd w:fill="E8EDF2"/>
           </w:tcPr>
           <w:p>
             <w:pPr>
@@ -241,7 +259,9 @@
         <w:tc>
           <w:tcPr>
             <w:vAlign w:val="center"/>
-            <w:shd w:fill="E2E8F0"/>
+            <w:tcW w:w="2592" w:type="dxa"/>
+            <w:vAlign w:val="center"/>
+            <w:shd w:fill="E8EDF2"/>
           </w:tcPr>
           <w:p>
             <w:pPr>
@@ -261,9 +281,13 @@
       <w:tr>
         <w:trPr>
           <w:cantSplit/>
+          <w:cantSplit/>
+          <w:trHeight w:hRule="atLeast" w:val="1368"/>
         </w:trPr>
         <w:tc>
           <w:tcPr>
+            <w:vAlign w:val="center"/>
+            <w:tcW w:w="4608" w:type="dxa"/>
             <w:vAlign w:val="center"/>
           </w:tcPr>
           <w:p>
@@ -339,6 +363,8 @@
         <w:tc>
           <w:tcPr>
             <w:vAlign w:val="center"/>
+            <w:tcW w:w="2592" w:type="dxa"/>
+            <w:vAlign w:val="center"/>
           </w:tcPr>
           <w:p>
             <w:pPr>
@@ -355,7 +381,8 @@
     <w:p>
       <w:pPr>
         <w:pStyle w:val="Heading1"/>
-        <w:spacing w:before="320" w:after="120"/>
+        <w:pageBreakBefore w:val="0"/>
+        <w:spacing w:before="160" w:after="80"/>
       </w:pPr>
       <w:r>
         <w:t xml:space="preserve">PART 2: CHECK YOUR UNDERSTANDING</w:t>

</xml_diff>